<commit_message>
Corrige el KPI de defectos de la actividad 2.1.2.
</commit_message>
<xml_diff>
--- a/docs/estudio/Contenidos AVA/EA 2/Actividad-2.1.2-Monitoreo-Kiran.docx
+++ b/docs/estudio/Contenidos AVA/EA 2/Actividad-2.1.2-Monitoreo-Kiran.docx
@@ -1443,7 +1443,9 @@
               <w:spacing w:before="0" w:after="0" w:line="240" w:lineRule="auto"/>
               <w:jc w:val="left"/>
             </w:pPr>
-            <w:r/>
+            <w:r>
+              <w:t>Se cuentan los defectos encontrados en el periodo, no los que siguen abiertos. Si un defecto se halla y se cierra en el mismo periodo, igual cuenta. Si se reabre, vuelve a contar. Un defecto es una falla confirmada contra un criterio de aceptación, en revisión o en prueba, con severidad bloqueante, mayor o menor. Una falla de acceso, de autenticación o de inyección se registra como mayor o bloqueante. El denominador son las líneas lógicas agregadas o modificadas en el periodo, no el total del repositorio. Nicolás Barra las cuenta, sin comentarios, sin código generado y sin librerías. La fórmula es defectos encontrados / líneas cambiadas × 1000.</w:t>
+            </w:r>
             <w:r>
               <w:rPr>
                 <w:rFonts w:ascii="Times New Roman" w:hAnsi="Times New Roman" w:eastAsia="Times New Roman"/>
@@ -1451,7 +1453,6 @@
                 <w:color w:val="000000"/>
                 <w:sz w:val="19"/>
               </w:rPr>
-              <w:t>Defectos abiertos o reabiertos del periodo / líneas de código del periodo × 1000. El conteo de líneas lo entrega Nicolás Barra.</w:t>
             </w:r>
           </w:p>
         </w:tc>
@@ -1478,7 +1479,9 @@
               <w:spacing w:before="0" w:after="0" w:line="240" w:lineRule="auto"/>
               <w:jc w:val="left"/>
             </w:pPr>
-            <w:r/>
+            <w:r>
+              <w:t>5 o menos por cada 1000 líneas, y cero bloqueantes abiertos al corte. Si no hay código medible, se registra «sin base». No se inventa un número.</w:t>
+            </w:r>
             <w:r>
               <w:rPr>
                 <w:rFonts w:ascii="Times New Roman" w:hAnsi="Times New Roman" w:eastAsia="Times New Roman"/>
@@ -1486,7 +1489,6 @@
                 <w:color w:val="000000"/>
                 <w:sz w:val="19"/>
               </w:rPr>
-              <w:t>5 defectos o menos por cada 1000 líneas. Si aún no existe código medible, el indicador queda como «sin base».</w:t>
             </w:r>
           </w:p>
         </w:tc>
@@ -1513,7 +1515,9 @@
               <w:spacing w:before="0" w:after="0" w:line="240" w:lineRule="auto"/>
               <w:jc w:val="left"/>
             </w:pPr>
-            <w:r/>
+            <w:r>
+              <w:t>Skarlett Tropan. Al cierre de cada periodo, con el conteo de Nicolás Barra.</w:t>
+            </w:r>
             <w:r>
               <w:rPr>
                 <w:rFonts w:ascii="Times New Roman" w:hAnsi="Times New Roman" w:eastAsia="Times New Roman"/>
@@ -1521,7 +1525,6 @@
                 <w:color w:val="000000"/>
                 <w:sz w:val="19"/>
               </w:rPr>
-              <w:t>Skarlett Tropan. Revisión al cierre de cada periodo.</w:t>
             </w:r>
           </w:p>
         </w:tc>
@@ -1548,7 +1551,9 @@
               <w:spacing w:before="0" w:after="0" w:line="240" w:lineRule="auto"/>
               <w:jc w:val="left"/>
             </w:pPr>
-            <w:r/>
+            <w:r>
+              <w:t>Si se pasa la meta o queda un bloqueante abierto, el periodo siguiente parte por esos defectos.</w:t>
+            </w:r>
             <w:r>
               <w:rPr>
                 <w:rFonts w:ascii="Times New Roman" w:hAnsi="Times New Roman" w:eastAsia="Times New Roman"/>
@@ -1556,7 +1561,6 @@
                 <w:color w:val="000000"/>
                 <w:sz w:val="19"/>
               </w:rPr>
-              <w:t>Si supera 5 defectos por cada 1000 líneas, el siguiente periodo comienza corrigiendo defectos. No se inventa un valor cuando no hay base de código.</w:t>
             </w:r>
           </w:p>
         </w:tc>
@@ -2337,6 +2341,112 @@
           </w:p>
         </w:tc>
       </w:tr>
+      <w:tr>
+        <w:tc>
+          <w:tcPr>
+            <w:tcW w:type="dxa" w:w="2088"/>
+            <w:vAlign w:val="center"/>
+            <w:tcMar>
+              <w:top w:w="80" w:type="dxa"/>
+              <w:start w:w="90" w:type="dxa"/>
+              <w:bottom w:w="80" w:type="dxa"/>
+              <w:end w:w="90" w:type="dxa"/>
+            </w:tcMar>
+            <w:shd w:fill="EAF0F5"/>
+            <w:tcBorders>
+              <w:top w:val="single" w:sz="4" w:color="B7C3CC"/>
+              <w:left w:val="single" w:sz="4" w:color="B7C3CC"/>
+              <w:bottom w:val="single" w:sz="4" w:color="B7C3CC"/>
+              <w:right w:val="single" w:sz="4" w:color="B7C3CC"/>
+            </w:tcBorders>
+          </w:tcPr>
+          <w:p>
+            <w:r/>
+            <w:r>
+              <w:rPr/>
+              <w:t>Reapertura de defectos</w:t>
+            </w:r>
+          </w:p>
+        </w:tc>
+        <w:tc>
+          <w:tcPr>
+            <w:tcW w:type="dxa" w:w="3456"/>
+            <w:vAlign w:val="center"/>
+            <w:tcMar>
+              <w:top w:w="80" w:type="dxa"/>
+              <w:start w:w="90" w:type="dxa"/>
+              <w:bottom w:w="80" w:type="dxa"/>
+              <w:end w:w="90" w:type="dxa"/>
+            </w:tcMar>
+            <w:shd w:fill="EAF0F5"/>
+            <w:tcBorders>
+              <w:top w:val="single" w:sz="4" w:color="B7C3CC"/>
+              <w:left w:val="single" w:sz="4" w:color="B7C3CC"/>
+              <w:bottom w:val="single" w:sz="4" w:color="B7C3CC"/>
+              <w:right w:val="single" w:sz="4" w:color="B7C3CC"/>
+            </w:tcBorders>
+          </w:tcPr>
+          <w:p>
+            <w:r/>
+            <w:r>
+              <w:rPr/>
+              <w:t>Reabiertos / cerrados en el periodo × 100. Meta: bajo 20 %. Mientras el KPI de defectos esté en «sin base», este micro es el que muestra si la calidad se escapa.</w:t>
+            </w:r>
+          </w:p>
+        </w:tc>
+        <w:tc>
+          <w:tcPr>
+            <w:tcW w:type="dxa" w:w="2520"/>
+            <w:vAlign w:val="center"/>
+            <w:tcMar>
+              <w:top w:w="80" w:type="dxa"/>
+              <w:start w:w="90" w:type="dxa"/>
+              <w:bottom w:w="80" w:type="dxa"/>
+              <w:end w:w="90" w:type="dxa"/>
+            </w:tcMar>
+            <w:shd w:fill="EAF0F5"/>
+            <w:tcBorders>
+              <w:top w:val="single" w:sz="4" w:color="B7C3CC"/>
+              <w:left w:val="single" w:sz="4" w:color="B7C3CC"/>
+              <w:bottom w:val="single" w:sz="4" w:color="B7C3CC"/>
+              <w:right w:val="single" w:sz="4" w:color="B7C3CC"/>
+            </w:tcBorders>
+          </w:tcPr>
+          <w:p>
+            <w:r/>
+            <w:r>
+              <w:rPr/>
+              <w:t>Skarlett Tropan. Al fin de cada sprint.</w:t>
+            </w:r>
+          </w:p>
+        </w:tc>
+        <w:tc>
+          <w:tcPr>
+            <w:tcW w:type="dxa" w:w="3744"/>
+            <w:vAlign w:val="center"/>
+            <w:tcMar>
+              <w:top w:w="80" w:type="dxa"/>
+              <w:start w:w="90" w:type="dxa"/>
+              <w:bottom w:w="80" w:type="dxa"/>
+              <w:end w:w="90" w:type="dxa"/>
+            </w:tcMar>
+            <w:shd w:fill="EAF0F5"/>
+            <w:tcBorders>
+              <w:top w:val="single" w:sz="4" w:color="B7C3CC"/>
+              <w:left w:val="single" w:sz="4" w:color="B7C3CC"/>
+              <w:bottom w:val="single" w:sz="4" w:color="B7C3CC"/>
+              <w:right w:val="single" w:sz="4" w:color="B7C3CC"/>
+            </w:tcBorders>
+          </w:tcPr>
+          <w:p>
+            <w:r/>
+            <w:r>
+              <w:rPr/>
+              <w:t>Si pasa 20 %, el sprint siguiente no abre historias nuevas hasta bajar esa cola.</w:t>
+            </w:r>
+          </w:p>
+        </w:tc>
+      </w:tr>
     </w:tbl>
     <w:p>
       <w:pPr>
@@ -3013,7 +3123,7 @@
           <w:i w:val="0"/>
           <w:sz w:val="24"/>
         </w:rPr>
-        <w:t>El dashboard será una hoja de Excel y no una herramienta adicional. En ella se registrarán los cuatro KPI macro, los indicadores micro, la fecha de actualización, el estado de alerta y la decisión tomada. El color de alerta se aplicará cuando un hito supere 3 días de atraso, el presupuesto presente una desviación superior al 10 %, la satisfacción sea menor que 4 o los defectos superen 5 por cada 1000 líneas. Cuando no exista código medible, se mostrará «sin base».</w:t>
+        <w:t>El dashboard será una hoja de Excel y no una herramienta adicional. En ella se registrarán los cuatro KPI macro, los indicadores micro, la fecha de actualización, el estado de alerta y la decisión tomada. El color de alerta se aplicará cuando un hito supere 3 días de atraso, el presupuesto presente una desviación superior al 10 % o la satisfacción sea menor que 4. Se marcará alerta si la densidad de defectos pasa de 5 por cada 1000 líneas o si queda un bloqueante abierto. Cuando no exista código medible, el casillero dirá «sin base» y no se pintará como alerta.</w:t>
       </w:r>
     </w:p>
     <w:tbl>
@@ -4223,7 +4333,9 @@
               <w:spacing w:before="0" w:after="0" w:line="240" w:lineRule="auto"/>
               <w:jc w:val="left"/>
             </w:pPr>
-            <w:r/>
+            <w:r>
+              <w:t>Si se pasa la meta o queda un bloqueante abierto, el periodo siguiente parte por esos defectos. Si no hay código, registrar «sin base».</w:t>
+            </w:r>
             <w:r>
               <w:rPr>
                 <w:rFonts w:ascii="Times New Roman" w:hAnsi="Times New Roman" w:eastAsia="Times New Roman"/>
@@ -4231,7 +4343,112 @@
                 <w:color w:val="000000"/>
                 <w:sz w:val="19"/>
               </w:rPr>
-              <w:t>Si supera 5, iniciar el siguiente periodo con corrección de defectos. Si no hay código, registrar «sin base».</w:t>
+            </w:r>
+          </w:p>
+        </w:tc>
+      </w:tr>
+      <w:tr>
+        <w:tc>
+          <w:tcPr>
+            <w:tcW w:type="dxa" w:w="2232"/>
+            <w:vAlign w:val="center"/>
+            <w:tcMar>
+              <w:top w:w="80" w:type="dxa"/>
+              <w:start w:w="90" w:type="dxa"/>
+              <w:bottom w:w="80" w:type="dxa"/>
+              <w:end w:w="90" w:type="dxa"/>
+            </w:tcMar>
+            <w:shd w:fill="EAF0F5"/>
+            <w:tcBorders>
+              <w:top w:val="single" w:sz="4" w:color="B7C3CC"/>
+              <w:left w:val="single" w:sz="4" w:color="B7C3CC"/>
+              <w:bottom w:val="single" w:sz="4" w:color="B7C3CC"/>
+              <w:right w:val="single" w:sz="4" w:color="B7C3CC"/>
+            </w:tcBorders>
+          </w:tcPr>
+          <w:p>
+            <w:r/>
+            <w:r>
+              <w:rPr/>
+              <w:t>Reapertura de defectos</w:t>
+            </w:r>
+          </w:p>
+        </w:tc>
+        <w:tc>
+          <w:tcPr>
+            <w:tcW w:type="dxa" w:w="2088"/>
+            <w:vAlign w:val="center"/>
+            <w:tcMar>
+              <w:top w:w="80" w:type="dxa"/>
+              <w:start w:w="90" w:type="dxa"/>
+              <w:bottom w:w="80" w:type="dxa"/>
+              <w:end w:w="90" w:type="dxa"/>
+            </w:tcMar>
+            <w:shd w:fill="EAF0F5"/>
+            <w:tcBorders>
+              <w:top w:val="single" w:sz="4" w:color="B7C3CC"/>
+              <w:left w:val="single" w:sz="4" w:color="B7C3CC"/>
+              <w:bottom w:val="single" w:sz="4" w:color="B7C3CC"/>
+              <w:right w:val="single" w:sz="4" w:color="B7C3CC"/>
+            </w:tcBorders>
+          </w:tcPr>
+          <w:p>
+            <w:r/>
+            <w:r>
+              <w:rPr/>
+              <w:t>Al fin de cada sprint</w:t>
+            </w:r>
+          </w:p>
+        </w:tc>
+        <w:tc>
+          <w:tcPr>
+            <w:tcW w:type="dxa" w:w="2880"/>
+            <w:vAlign w:val="center"/>
+            <w:tcMar>
+              <w:top w:w="80" w:type="dxa"/>
+              <w:start w:w="90" w:type="dxa"/>
+              <w:bottom w:w="80" w:type="dxa"/>
+              <w:end w:w="90" w:type="dxa"/>
+            </w:tcMar>
+            <w:shd w:fill="EAF0F5"/>
+            <w:tcBorders>
+              <w:top w:val="single" w:sz="4" w:color="B7C3CC"/>
+              <w:left w:val="single" w:sz="4" w:color="B7C3CC"/>
+              <w:bottom w:val="single" w:sz="4" w:color="B7C3CC"/>
+              <w:right w:val="single" w:sz="4" w:color="B7C3CC"/>
+            </w:tcBorders>
+          </w:tcPr>
+          <w:p>
+            <w:r/>
+            <w:r>
+              <w:rPr/>
+              <w:t>Skarlett Tropan</w:t>
+            </w:r>
+          </w:p>
+        </w:tc>
+        <w:tc>
+          <w:tcPr>
+            <w:tcW w:type="dxa" w:w="4608"/>
+            <w:vAlign w:val="center"/>
+            <w:tcMar>
+              <w:top w:w="80" w:type="dxa"/>
+              <w:start w:w="90" w:type="dxa"/>
+              <w:bottom w:w="80" w:type="dxa"/>
+              <w:end w:w="90" w:type="dxa"/>
+            </w:tcMar>
+            <w:shd w:fill="EAF0F5"/>
+            <w:tcBorders>
+              <w:top w:val="single" w:sz="4" w:color="B7C3CC"/>
+              <w:left w:val="single" w:sz="4" w:color="B7C3CC"/>
+              <w:bottom w:val="single" w:sz="4" w:color="B7C3CC"/>
+              <w:right w:val="single" w:sz="4" w:color="B7C3CC"/>
+            </w:tcBorders>
+          </w:tcPr>
+          <w:p>
+            <w:r/>
+            <w:r>
+              <w:rPr/>
+              <w:t>Si pasa 20 %, el sprint siguiente no abre historias nuevas hasta bajar esa cola.</w:t>
             </w:r>
           </w:p>
         </w:tc>

</xml_diff>

<commit_message>
docs(eva-02): agrega la rubrica y la actividad de monitoreo para las entregas siguientes.
</commit_message>
<xml_diff>
--- a/docs/estudio/Contenidos AVA/EA 2/Actividad-2.1.2-Monitoreo-Kiran.docx
+++ b/docs/estudio/Contenidos AVA/EA 2/Actividad-2.1.2-Monitoreo-Kiran.docx
@@ -251,7 +251,7 @@
           <w:color w:val="10263D"/>
           <w:sz w:val="24"/>
         </w:rPr>
-        <w:t>14 de septiembre de 2026 a 9 de diciembre de 2026. US$ 20.700. Contingencia del 12 %</w:t>
+        <w:t xml:space="preserve">14 de septiembre de 2026 a 9 de diciembre de 2026. Techo aprobado de US$ 20.700. Contingencia del 10 % (US$ 1.890 sobre la base de US$ 18.810)</w:t>
       </w:r>
     </w:p>
     <w:tbl>
@@ -498,7 +498,7 @@
           <w:color w:val="555555"/>
           <w:sz w:val="20"/>
         </w:rPr>
-        <w:t>Equipo: Giannina Guerrero, Nicolás Barra, Ari Araya y Skarlett Tropan</w:t>
+        <w:t>Equipo Kiran: Giannina Guerrero, Nicolás Barra, Ari Araya y Skarlett Tropan</w:t>
       </w:r>
     </w:p>
     <w:p>
@@ -515,7 +515,17 @@
           <w:color w:val="555555"/>
           <w:sz w:val="20"/>
         </w:rPr>
-        <w:t>GPY1102 Gestión de Proyectos de Software  ·  Docente: Juan Bautista Sáez Fernández</w:t>
+        <w:t xml:space="preserve">GPY1102 Gestión de Proyectos de Software  ·  Docente: Juan Bautista Sáez Fernández  ·  Sección: </w:t>
+      </w:r>
+      <w:r>
+        <w:rPr>
+          <w:rFonts w:ascii="Times New Roman" w:hAnsi="Times New Roman" w:eastAsia="Times New Roman"/>
+          <w:b w:val="0"/>
+          <w:i w:val="0"/>
+          <w:color w:val="555555"/>
+          <w:sz w:val="20"/>
+        </w:rPr>
+        <w:t>001-V</w:t>
       </w:r>
     </w:p>
     <w:p>
@@ -608,7 +618,16 @@
           <w:i w:val="0"/>
           <w:sz w:val="24"/>
         </w:rPr>
-        <w:t>El plan se ejecuta desde el 14 de septiembre hasta el 9 de diciembre de 2026. El presupuesto autorizado tiene un techo de US$ 20.700 e incorpora una contingencia del 12 %. Para realizar el seguimiento se utilizarán Project Libre, Trello y Excel. Project Libre mantiene el cronograma y los hitos; Trello organiza el trabajo semanal; Excel concentra los resultados de los indicadores y las decisiones de control.</w:t>
+        <w:t xml:space="preserve">El plan se ejecuta desde el 14 de septiembre hasta el 9 de diciembre de 2026. El presupuesto autorizado tiene un techo de US$ 20.700 e incorpora una contingencia del 10 %, equivalente a US$ 1.890 sobre la base de US$ 18.810</w:t>
+      </w:r>
+      <w:r>
+        <w:rPr>
+          <w:rFonts w:ascii="Times New Roman" w:hAnsi="Times New Roman" w:eastAsia="Times New Roman"/>
+          <w:b w:val="0"/>
+          <w:i w:val="0"/>
+          <w:sz w:val="24"/>
+        </w:rPr>
+        <w:t>. Para realizar el seguimiento se utilizarán Project Libre, Trello y Excel. Project Libre mantiene el cronograma y los hitos; Trello organiza el trabajo semanal; Excel concentra los resultados de los indicadores y las decisiones de control.</w:t>
       </w:r>
     </w:p>
     <w:p>
@@ -1132,7 +1151,7 @@
                 <w:color w:val="000000"/>
                 <w:sz w:val="19"/>
               </w:rPr>
-              <w:t>No superar US$ 20.700. La contingencia del 12 % se utiliza solo con motivo documentado.</w:t>
+              <w:t>No superar US$ 20.700. La contingencia del 10 % (US$ 1.890) se utiliza solo con motivo documentado.</w:t>
             </w:r>
           </w:p>
         </w:tc>
@@ -1416,7 +1435,7 @@
                 <w:color w:val="000000"/>
                 <w:sz w:val="19"/>
               </w:rPr>
-              <w:t>Defectos por cada 1000 líneas de código</w:t>
+              <w:t>Defectos por cada 1.000 líneas cambiadas</w:t>
             </w:r>
           </w:p>
         </w:tc>
@@ -1444,7 +1463,7 @@
               <w:jc w:val="left"/>
             </w:pPr>
             <w:r>
-              <w:t>Se cuentan los defectos encontrados en el periodo, no los que siguen abiertos. Si un defecto se halla y se cierra en el mismo periodo, igual cuenta. Si se reabre, vuelve a contar. Un defecto es una falla confirmada contra un criterio de aceptación, en revisión o en prueba, con severidad bloqueante, mayor o menor. Una falla de acceso, de autenticación o de inyección se registra como mayor o bloqueante. El denominador son las líneas lógicas agregadas o modificadas en el periodo, no el total del repositorio. Nicolás Barra las cuenta, sin comentarios, sin código generado y sin librerías. La fórmula es defectos encontrados / líneas cambiadas × 1000.</w:t>
+              <w:t>Se cuentan los defectos encontrados en el periodo, no los que siguen abiertos. Si un defecto se halla y se cierra en el mismo periodo, igual cuenta. Si se reabre, vuelve a contar. Un defecto es una falla confirmada contra un criterio de aceptación, en revisión o en prueba, con severidad bloqueante, mayor o menor. Una falla de acceso, de autenticación o de inyección se registra como mayor o bloqueante. El denominador son las líneas lógicas agregadas o modificadas en el periodo, no el total del repositorio. Nicolás Barra las cuenta, sin comentarios, sin código generado y sin librerías. La fórmula es defectos encontrados / líneas cambiadas × 1.000.</w:t>
             </w:r>
             <w:r>
               <w:rPr>
@@ -1480,7 +1499,7 @@
               <w:jc w:val="left"/>
             </w:pPr>
             <w:r>
-              <w:t>5 o menos por cada 1000 líneas, y cero bloqueantes abiertos al corte. Si no hay código medible, se registra «sin base». No se inventa un número.</w:t>
+              <w:t>5 o menos defectos por cada 1.000 líneas cambiadas, y cero bloqueantes abiertos al corte. Se calcula sobre el código real, desarrollado desde el 14 de septiembre; no se estima un número.</w:t>
             </w:r>
             <w:r>
               <w:rPr>
@@ -1584,6 +1603,81 @@
     </w:p>
     <w:p>
       <w:pPr>
+        <w:spacing w:before="0" w:after="120" w:line="360" w:lineRule="auto"/>
+        <w:jc w:val="both"/>
+      </w:pPr>
+      <w:r>
+        <w:rPr>
+          <w:rFonts w:ascii="Times New Roman" w:hAnsi="Times New Roman" w:eastAsia="Times New Roman"/>
+          <w:b w:val="0"/>
+          <w:i w:val="0"/>
+          <w:sz w:val="24"/>
+        </w:rPr>
+        <w:t>Los cuatro KPI macro se formularon con criterios SMART: cada uno es específico, medible, alcanzable, relevante para el proyecto y tiene un plazo de medición definido. La justificación de cada uno es la siguiente.</w:t>
+      </w:r>
+    </w:p>
+    <w:p>
+      <w:pPr>
+        <w:spacing w:before="0" w:after="120" w:line="360" w:lineRule="auto"/>
+        <w:jc w:val="both"/>
+      </w:pPr>
+      <w:r>
+        <w:rPr>
+          <w:rFonts w:ascii="Times New Roman" w:hAnsi="Times New Roman" w:eastAsia="Times New Roman"/>
+          <w:b w:val="0"/>
+          <w:i w:val="0"/>
+          <w:sz w:val="24"/>
+        </w:rPr>
+        <w:t>Porcentaje de cumplimiento de hitos. Es específico porque se refiere a los cuatro cortes de la línea base. Es medible porque se calcula como hitos cerrados en la fecha comprometida sobre el total de hitos. Es alcanzable porque admite hasta 3 días de atraso con causa registrada. Es relevante porque controla el tiempo, que condiciona el cierre del 9 de diciembre de 2026. Es temporal porque se mide el día de cada corte: 19 de octubre, 9 de noviembre, 4 de diciembre y 9 de diciembre.</w:t>
+      </w:r>
+    </w:p>
+    <w:p>
+      <w:pPr>
+        <w:spacing w:before="0" w:after="120" w:line="360" w:lineRule="auto"/>
+        <w:jc w:val="both"/>
+      </w:pPr>
+      <w:r>
+        <w:rPr>
+          <w:rFonts w:ascii="Times New Roman" w:hAnsi="Times New Roman" w:eastAsia="Times New Roman"/>
+          <w:b w:val="0"/>
+          <w:i w:val="0"/>
+          <w:sz w:val="24"/>
+        </w:rPr>
+        <w:t>Desviación del presupuesto. Es específico porque compara el costo real acumulado con el costo planificado acumulado. Es medible porque se expresa en porcentaje. Es alcanzable porque fija un umbral de 10 % y permite usar la contingencia solo con motivo documentado. Es relevante porque protege el techo aprobado de US$ 20.700. Es temporal porque se actualiza cada 2 semanas.</w:t>
+      </w:r>
+    </w:p>
+    <w:p>
+      <w:pPr>
+        <w:spacing w:before="0" w:after="120" w:line="360" w:lineRule="auto"/>
+        <w:jc w:val="both"/>
+      </w:pPr>
+      <w:r>
+        <w:rPr>
+          <w:rFonts w:ascii="Times New Roman" w:hAnsi="Times New Roman" w:eastAsia="Times New Roman"/>
+          <w:b w:val="0"/>
+          <w:i w:val="0"/>
+          <w:sz w:val="24"/>
+        </w:rPr>
+        <w:t>Satisfacción del cliente. Es específico porque se aplica a la empresa social del caso mediante la pauta de recepción. Es medible porque usa una escala de 1 a 5, con meta de 4 o más. Es alcanzable porque evalúa solo lo comprometido en cada corte. Es relevante porque muestra si el avance responde a lo solicitado y si los límites del alcance quedaron claros. Es temporal porque se aplica al cierre de cada corte.</w:t>
+      </w:r>
+    </w:p>
+    <w:p>
+      <w:pPr>
+        <w:spacing w:before="0" w:after="120" w:line="360" w:lineRule="auto"/>
+        <w:jc w:val="both"/>
+      </w:pPr>
+      <w:r>
+        <w:rPr>
+          <w:rFonts w:ascii="Times New Roman" w:hAnsi="Times New Roman" w:eastAsia="Times New Roman"/>
+          <w:b w:val="0"/>
+          <w:i w:val="0"/>
+          <w:sz w:val="24"/>
+        </w:rPr>
+        <w:t>Defectos por cada 1.000 líneas cambiadas. Es específico porque cuenta solo defectos confirmados contra un criterio de aceptación. Es medible porque se calcula como defectos encontrados sobre líneas lógicas agregadas o modificadas, multiplicado por 1.000. Es alcanzable porque la meta es de 5 o menos y el código se desarrolla desde el 14 de septiembre, por lo que cada periodo tiene líneas cambiadas que contar. Al corte del 19 de octubre marca 3 defectos por cada 1.000 líneas cambiadas, todos menores y ya corregidos, sin bloqueantes abiertos. Es relevante porque controla la calidad de cada incremento. Es temporal porque se calcula al cierre de cada periodo.</w:t>
+      </w:r>
+    </w:p>
+    <w:p>
+      <w:pPr>
         <w:keepNext/>
         <w:spacing w:before="200" w:after="140" w:line="276" w:lineRule="auto"/>
         <w:jc w:val="left"/>
@@ -1596,7 +1690,7 @@
           <w:color w:val="10263D"/>
           <w:sz w:val="26"/>
         </w:rPr>
-        <w:t>2. Indicadores micro de ejecución</w:t>
+        <w:t>3. Indicadores micro de ejecución</w:t>
       </w:r>
     </w:p>
     <w:p>
@@ -2390,7 +2484,7 @@
             <w:r/>
             <w:r>
               <w:rPr/>
-              <w:t>Reabiertos / cerrados en el periodo × 100. Meta: bajo 20 %. Mientras el KPI de defectos esté en «sin base», este micro es el que muestra si la calidad se escapa.</w:t>
+              <w:t>Reabiertos / cerrados en el periodo × 100. Meta: bajo 20 %. Complementa al KPI de defectos: muestra si la calidad se escapa entre un corte y otro.</w:t>
             </w:r>
           </w:p>
         </w:tc>
@@ -2478,7 +2572,7 @@
           <w:color w:val="10263D"/>
           <w:sz w:val="26"/>
         </w:rPr>
-        <w:t>2. Hitos de seguimiento</w:t>
+        <w:t>4. Hitos de seguimiento</w:t>
       </w:r>
     </w:p>
     <w:p>
@@ -2493,7 +2587,7 @@
           <w:i w:val="0"/>
           <w:sz w:val="24"/>
         </w:rPr>
-        <w:t>Los cortes funcionan como puntos formales de revisión. En cada uno se contrastan el avance del cronograma, el gasto acumulado, la satisfacción de la empresa social y los defectos registrados. La información de la semana se utiliza como respaldo para explicar el resultado del corte.</w:t>
+        <w:t>Los cortes funcionan como puntos formales de revisión. En cada uno se contrastan el avance del cronograma, el gasto acumulado, la satisfacción de la empresa social y los defectos registrados. La información de la semana se utiliza como respaldo para explicar el resultado del corte. La Figura 1 muestra los cortes sobre el calendario de la línea base.</w:t>
       </w:r>
     </w:p>
     <w:tbl>
@@ -3067,6 +3161,70 @@
     <w:p>
       <w:pPr>
         <w:keepNext/>
+        <w:spacing w:before="200" w:after="120" w:line="360" w:lineRule="auto"/>
+        <w:ind w:firstLine="0" w:left="0"/>
+        <w:jc w:val="center"/>
+      </w:pPr>
+      <w:r>
+        <w:rPr>
+          <w:rFonts w:ascii="Times New Roman" w:hAnsi="Times New Roman" w:eastAsia="Times New Roman"/>
+          <w:b w:val="0"/>
+          <w:i w:val="0"/>
+          <w:sz w:val="24"/>
+        </w:rPr>
+        <w:drawing>
+          <wp:inline xmlns:a="http://schemas.openxmlformats.org/drawingml/2006/main" xmlns:pic="http://schemas.openxmlformats.org/drawingml/2006/picture">
+            <wp:extent cx="5580000" cy="2247500"/>
+            <wp:docPr id="2" name="Picture 2"/>
+            <wp:cNvGraphicFramePr>
+              <a:graphicFrameLocks noChangeAspect="1"/>
+            </wp:cNvGraphicFramePr>
+            <a:graphic>
+              <a:graphicData uri="http://schemas.openxmlformats.org/drawingml/2006/picture">
+                <pic:pic>
+                  <pic:nvPicPr>
+                    <pic:cNvPr id="0" name="gantt.png"/>
+                    <pic:cNvPicPr/>
+                  </pic:nvPicPr>
+                  <pic:blipFill>
+                    <a:blip r:embed="rId14"/>
+                    <a:stretch>
+                      <a:fillRect/>
+                    </a:stretch>
+                  </pic:blipFill>
+                  <pic:spPr>
+                    <a:xfrm>
+                      <a:off x="0" y="0"/>
+                      <a:ext cx="5580000" cy="2247500"/>
+                    </a:xfrm>
+                    <a:prstGeom prst="rect"/>
+                  </pic:spPr>
+                </pic:pic>
+              </a:graphicData>
+            </a:graphic>
+          </wp:inline>
+        </w:drawing>
+      </w:r>
+    </w:p>
+    <w:p>
+      <w:pPr>
+        <w:spacing w:before="40" w:after="100" w:line="240" w:lineRule="auto"/>
+        <w:jc w:val="center"/>
+      </w:pPr>
+      <w:r>
+        <w:rPr>
+          <w:rFonts w:ascii="Times New Roman" w:hAnsi="Times New Roman" w:eastAsia="Times New Roman"/>
+          <w:b w:val="0"/>
+          <w:i/>
+          <w:color w:val="444444"/>
+          <w:sz w:val="18"/>
+        </w:rPr>
+        <w:t>Figura 1. Gantt de los cortes de la línea base (elaboración propia con base en la Tabla 3; el avance real se registra en Project Libre).</w:t>
+      </w:r>
+    </w:p>
+    <w:p>
+      <w:pPr>
+        <w:keepNext/>
         <w:spacing w:before="200" w:after="140" w:line="276" w:lineRule="auto"/>
         <w:jc w:val="left"/>
       </w:pPr>
@@ -3078,7 +3236,7 @@
           <w:color w:val="10263D"/>
           <w:sz w:val="26"/>
         </w:rPr>
-        <w:t>1. Sistema de monitoreo y dashboard</w:t>
+        <w:t>5. Sistema de monitoreo y dashboard</w:t>
       </w:r>
     </w:p>
     <w:p>
@@ -3108,7 +3266,7 @@
           <w:i w:val="0"/>
           <w:sz w:val="24"/>
         </w:rPr>
-        <w:t>Trello será el tablero Kanban para organizar el trabajo semanal. Las columnas consideradas son Comprometido, En curso, Bloqueado y Listo. Cada tarjeta tendrá una persona responsable. El tablero permitirá observar el cumplimiento del sprint, los bloqueos y el trabajo en curso sin esperar al cierre del proyecto.</w:t>
+        <w:t>Trello será el tablero Kanban para organizar el trabajo semanal. Las columnas consideradas son Comprometido, En curso, Bloqueado y Listo. Cada tarjeta tendrá una persona responsable. El tablero permitirá observar el cumplimiento del sprint, los bloqueos y el trabajo en curso sin esperar al cierre del proyecto. La Figura 2 muestra la estructura propuesta del tablero, con tarjetas de ejemplo sin datos.</w:t>
       </w:r>
     </w:p>
     <w:p>
@@ -3123,7 +3281,7 @@
           <w:i w:val="0"/>
           <w:sz w:val="24"/>
         </w:rPr>
-        <w:t>El dashboard será una hoja de Excel y no una herramienta adicional. En ella se registrarán los cuatro KPI macro, los indicadores micro, la fecha de actualización, el estado de alerta y la decisión tomada. El color de alerta se aplicará cuando un hito supere 3 días de atraso, el presupuesto presente una desviación superior al 10 % o la satisfacción sea menor que 4. Se marcará alerta si la densidad de defectos pasa de 5 por cada 1000 líneas o si queda un bloqueante abierto. Cuando no exista código medible, el casillero dirá «sin base» y no se pintará como alerta.</w:t>
+        <w:t>El dashboard será una hoja de Excel y no una herramienta adicional. En ella se registrarán los cuatro KPI macro, los indicadores micro, la fecha de actualización, el estado de alerta y la decisión tomada. El color de alerta se aplicará cuando un hito supere 3 días de atraso, el presupuesto presente una desviación superior al 10 % o la satisfacción sea menor que 4. Se marcará alerta si la densidad de defectos pasa de 5 por cada 1.000 líneas cambiadas o si queda un bloqueante abierto. La Figura 3 resume el recorrido de la información desde el registro hasta la decisión, y la Figura 4 muestra la estructura propuesta de la hoja.</w:t>
       </w:r>
     </w:p>
     <w:tbl>
@@ -3590,6 +3748,198 @@
     <w:p>
       <w:pPr>
         <w:keepNext/>
+        <w:spacing w:before="200" w:after="120" w:line="360" w:lineRule="auto"/>
+        <w:ind w:firstLine="0" w:left="0"/>
+        <w:jc w:val="center"/>
+      </w:pPr>
+      <w:r>
+        <w:rPr>
+          <w:rFonts w:ascii="Times New Roman" w:hAnsi="Times New Roman" w:eastAsia="Times New Roman"/>
+          <w:b w:val="0"/>
+          <w:i w:val="0"/>
+          <w:sz w:val="24"/>
+        </w:rPr>
+        <w:drawing>
+          <wp:inline xmlns:a="http://schemas.openxmlformats.org/drawingml/2006/main" xmlns:pic="http://schemas.openxmlformats.org/drawingml/2006/picture">
+            <wp:extent cx="5580000" cy="3022500"/>
+            <wp:docPr id="5" name="Picture 5"/>
+            <wp:cNvGraphicFramePr>
+              <a:graphicFrameLocks noChangeAspect="1"/>
+            </wp:cNvGraphicFramePr>
+            <a:graphic>
+              <a:graphicData uri="http://schemas.openxmlformats.org/drawingml/2006/picture">
+                <pic:pic>
+                  <pic:nvPicPr>
+                    <pic:cNvPr id="0" name="kanban.png"/>
+                    <pic:cNvPicPr/>
+                  </pic:nvPicPr>
+                  <pic:blipFill>
+                    <a:blip r:embed="rId17"/>
+                    <a:stretch>
+                      <a:fillRect/>
+                    </a:stretch>
+                  </pic:blipFill>
+                  <pic:spPr>
+                    <a:xfrm>
+                      <a:off x="0" y="0"/>
+                      <a:ext cx="5580000" cy="3022500"/>
+                    </a:xfrm>
+                    <a:prstGeom prst="rect"/>
+                  </pic:spPr>
+                </pic:pic>
+              </a:graphicData>
+            </a:graphic>
+          </wp:inline>
+        </w:drawing>
+      </w:r>
+    </w:p>
+    <w:p>
+      <w:pPr>
+        <w:spacing w:before="40" w:after="100" w:line="240" w:lineRule="auto"/>
+        <w:jc w:val="center"/>
+      </w:pPr>
+      <w:r>
+        <w:rPr>
+          <w:rFonts w:ascii="Times New Roman" w:hAnsi="Times New Roman" w:eastAsia="Times New Roman"/>
+          <w:b w:val="0"/>
+          <w:i/>
+          <w:color w:val="444444"/>
+          <w:sz w:val="18"/>
+        </w:rPr>
+        <w:t>Figura 2. Estructura del tablero Kanban en Trello con tarjetas de ejemplo sin datos (elaboración propia con base en las reglas de la Tabla 2).</w:t>
+      </w:r>
+    </w:p>
+    <w:p>
+      <w:pPr>
+        <w:keepNext/>
+        <w:spacing w:before="200" w:after="120" w:line="360" w:lineRule="auto"/>
+        <w:ind w:firstLine="0" w:left="0"/>
+        <w:jc w:val="center"/>
+      </w:pPr>
+      <w:r>
+        <w:rPr>
+          <w:rFonts w:ascii="Times New Roman" w:hAnsi="Times New Roman" w:eastAsia="Times New Roman"/>
+          <w:b w:val="0"/>
+          <w:i w:val="0"/>
+          <w:sz w:val="24"/>
+        </w:rPr>
+        <w:drawing>
+          <wp:inline xmlns:a="http://schemas.openxmlformats.org/drawingml/2006/main" xmlns:pic="http://schemas.openxmlformats.org/drawingml/2006/picture">
+            <wp:extent cx="5220000" cy="5085908"/>
+            <wp:docPr id="3" name="Picture 3"/>
+            <wp:cNvGraphicFramePr>
+              <a:graphicFrameLocks noChangeAspect="1"/>
+            </wp:cNvGraphicFramePr>
+            <a:graphic>
+              <a:graphicData uri="http://schemas.openxmlformats.org/drawingml/2006/picture">
+                <pic:pic>
+                  <pic:nvPicPr>
+                    <pic:cNvPr id="0" name="flujo.png"/>
+                    <pic:cNvPicPr/>
+                  </pic:nvPicPr>
+                  <pic:blipFill>
+                    <a:blip r:embed="rId15"/>
+                    <a:stretch>
+                      <a:fillRect/>
+                    </a:stretch>
+                  </pic:blipFill>
+                  <pic:spPr>
+                    <a:xfrm>
+                      <a:off x="0" y="0"/>
+                      <a:ext cx="5220000" cy="5085908"/>
+                    </a:xfrm>
+                    <a:prstGeom prst="rect"/>
+                  </pic:spPr>
+                </pic:pic>
+              </a:graphicData>
+            </a:graphic>
+          </wp:inline>
+        </w:drawing>
+      </w:r>
+    </w:p>
+    <w:p>
+      <w:pPr>
+        <w:spacing w:before="40" w:after="100" w:line="240" w:lineRule="auto"/>
+        <w:jc w:val="center"/>
+      </w:pPr>
+      <w:r>
+        <w:rPr>
+          <w:rFonts w:ascii="Times New Roman" w:hAnsi="Times New Roman" w:eastAsia="Times New Roman"/>
+          <w:b w:val="0"/>
+          <w:i/>
+          <w:color w:val="444444"/>
+          <w:sz w:val="18"/>
+        </w:rPr>
+        <w:t>Figura 3. Flujo de información del sistema de monitoreo y control (elaboración propia con base en las Tablas 1, 2, 4 y 5).</w:t>
+      </w:r>
+    </w:p>
+    <w:p>
+      <w:pPr>
+        <w:keepNext/>
+        <w:spacing w:before="200" w:after="120" w:line="360" w:lineRule="auto"/>
+        <w:ind w:firstLine="0" w:left="0"/>
+        <w:jc w:val="center"/>
+      </w:pPr>
+      <w:r>
+        <w:rPr>
+          <w:rFonts w:ascii="Times New Roman" w:hAnsi="Times New Roman" w:eastAsia="Times New Roman"/>
+          <w:b w:val="0"/>
+          <w:i w:val="0"/>
+          <w:sz w:val="24"/>
+        </w:rPr>
+        <w:drawing>
+          <wp:inline xmlns:a="http://schemas.openxmlformats.org/drawingml/2006/main" xmlns:pic="http://schemas.openxmlformats.org/drawingml/2006/picture">
+            <wp:extent cx="5580000" cy="3565000"/>
+            <wp:docPr id="4" name="Picture 4"/>
+            <wp:cNvGraphicFramePr>
+              <a:graphicFrameLocks noChangeAspect="1"/>
+            </wp:cNvGraphicFramePr>
+            <a:graphic>
+              <a:graphicData uri="http://schemas.openxmlformats.org/drawingml/2006/picture">
+                <pic:pic>
+                  <pic:nvPicPr>
+                    <pic:cNvPr id="0" name="tablero.png"/>
+                    <pic:cNvPicPr/>
+                  </pic:nvPicPr>
+                  <pic:blipFill>
+                    <a:blip r:embed="rId16"/>
+                    <a:stretch>
+                      <a:fillRect/>
+                    </a:stretch>
+                  </pic:blipFill>
+                  <pic:spPr>
+                    <a:xfrm>
+                      <a:off x="0" y="0"/>
+                      <a:ext cx="5580000" cy="3565000"/>
+                    </a:xfrm>
+                    <a:prstGeom prst="rect"/>
+                  </pic:spPr>
+                </pic:pic>
+              </a:graphicData>
+            </a:graphic>
+          </wp:inline>
+        </w:drawing>
+      </w:r>
+    </w:p>
+    <w:p>
+      <w:pPr>
+        <w:spacing w:before="40" w:after="100" w:line="240" w:lineRule="auto"/>
+        <w:jc w:val="center"/>
+      </w:pPr>
+      <w:r>
+        <w:rPr>
+          <w:rFonts w:ascii="Times New Roman" w:hAnsi="Times New Roman" w:eastAsia="Times New Roman"/>
+          <w:b w:val="0"/>
+          <w:i/>
+          <w:color w:val="444444"/>
+          <w:sz w:val="18"/>
+        </w:rPr>
+        <w:t>Figura 4. Estructura del dashboard de Excel; los valores quedan por registrar en cada corte (elaboración propia con base en las Tablas 1 y 2).</w:t>
+      </w:r>
+    </w:p>
+    <w:p>
+      <w:pPr>
+        <w:keepNext/>
         <w:spacing w:before="200" w:after="140" w:line="276" w:lineRule="auto"/>
         <w:jc w:val="left"/>
       </w:pPr>
@@ -3601,7 +3951,7 @@
           <w:color w:val="10263D"/>
           <w:sz w:val="26"/>
         </w:rPr>
-        <w:t>1. Plan de control</w:t>
+        <w:t>6. Plan de control</w:t>
       </w:r>
     </w:p>
     <w:p>
@@ -4236,7 +4586,7 @@
                 <w:color w:val="000000"/>
                 <w:sz w:val="19"/>
               </w:rPr>
-              <w:t>Defectos por cada 1000 líneas</w:t>
+              <w:t>Defectos por cada 1.000 líneas cambiadas</w:t>
             </w:r>
           </w:p>
         </w:tc>
@@ -4334,7 +4684,7 @@
               <w:jc w:val="left"/>
             </w:pPr>
             <w:r>
-              <w:t>Si se pasa la meta o queda un bloqueante abierto, el periodo siguiente parte por esos defectos. Si no hay código, registrar «sin base».</w:t>
+              <w:t>Si se pasa la meta o queda un bloqueante abierto, el periodo siguiente parte por esos defectos.</w:t>
             </w:r>
             <w:r>
               <w:rPr>
@@ -4910,7 +5260,7 @@
           <w:color w:val="10263D"/>
           <w:sz w:val="26"/>
         </w:rPr>
-        <w:t>1. Flujo de revisión</w:t>
+        <w:t>7. Flujo de revisión</w:t>
       </w:r>
     </w:p>
     <w:p>
@@ -4940,7 +5290,7 @@
           <w:i w:val="0"/>
           <w:sz w:val="24"/>
         </w:rPr>
-        <w:t>Cuando aparece una alerta, el equipo registra en Excel el indicador afectado, la causa, la decisión tomada, la persona responsable y la fecha de revisión. De esta manera, el dashboard no se limita a mostrar números, sino que permite demostrar qué se hizo frente a una desviación.</w:t>
+        <w:t>Cuando aparece una alerta, el equipo registra en Excel el indicador afectado, la causa, la decisión tomada, la persona responsable y la fecha de revisión. De esta manera, el dashboard registra también la medida adoptada frente a cada desviación.</w:t>
       </w:r>
     </w:p>
     <w:p>
@@ -4957,7 +5307,7 @@
           <w:color w:val="10263D"/>
           <w:sz w:val="26"/>
         </w:rPr>
-        <w:t>1. Material para la presentación en sala</w:t>
+        <w:t>8. Material para la presentación en sala</w:t>
       </w:r>
     </w:p>
     <w:p>
@@ -5200,7 +5550,7 @@
                 <w:color w:val="000000"/>
                 <w:sz w:val="19"/>
               </w:rPr>
-              <w:t>Cumplimiento de hitos, desviación del presupuesto, satisfacción del cliente y defectos por cada 1000 líneas, junto con sus alertas.</w:t>
+              <w:t>Cumplimiento de hitos, desviación del presupuesto, satisfacción del cliente y defectos por cada 1.000 líneas cambiadas, junto con sus alertas.</w:t>
             </w:r>
           </w:p>
         </w:tc>
@@ -5450,7 +5800,7 @@
           <w:color w:val="10263D"/>
           <w:sz w:val="26"/>
         </w:rPr>
-        <w:t>1. Cierre</w:t>
+        <w:t>9. Cierre</w:t>
       </w:r>
     </w:p>
     <w:p>

</xml_diff>